<commit_message>
Update questions with authentic Treasure Island characters and events
</commit_message>
<xml_diff>
--- a/第三學習階段遊戲題庫.docx
+++ b/第三學習階段遊戲題庫.docx
@@ -31,7 +31,7 @@
           <w:color w:val="7F8C8D"/>
           <w:sz w:val="24"/>
         </w:rPr>
-        <w:t>── 專案主題：金銀島的密碼羅盤（五至六年級能力指標隨機抽樣 50 題） ──</w:t>
+        <w:t>── 專案主題：金銀島：弗林特的寶藏（五至六年級能力指標 50 題） ──</w:t>
       </w:r>
     </w:p>
     <w:p>
@@ -61,7 +61,7 @@
           <w:color w:val="333333"/>
           <w:sz w:val="22"/>
         </w:rPr>
-        <w:t>1. 金銀島的海盜船長黑鬍子在藏寶箱上發現了一個古老的密碼鎖，需要解開以下位值關係：一兆是幾個一億？一億是幾個一萬？解開它就能拿到寶藏！</w:t>
+        <w:t>1. 弗林特船長在金銀島上埋藏了巨大的財富。大副比利·蓬斯在手記中記載：『若要開鎖，需解開十進位的秘密：一兆是幾個一億？一億是幾個一萬？』請幫忙解開這個謎題。</w:t>
       </w:r>
     </w:p>
     <w:p>
@@ -140,7 +140,7 @@
           <w:color w:val="333333"/>
           <w:sz w:val="22"/>
         </w:rPr>
-        <w:t>2. 航海士在古老航海圖的角落發現了一個神祕的小數「0.0075」，這代表著藏寶點的偏角。請問這個數讀作什麼？其中的「7」和「5」分別在什麼位數？</w:t>
+        <w:t>2. 少年吉姆在比利·蓬斯的水手衣物箱底發現了一張古老航海圖，角落用極小的紅墨水標記著一個小數「0.0075」。請問這個數讀作什麼？其中的「7」和「5」分別在什麼位數？</w:t>
       </w:r>
     </w:p>
     <w:p>
@@ -219,7 +219,7 @@
           <w:color w:val="333333"/>
           <w:sz w:val="22"/>
         </w:rPr>
-        <w:t>3. 密碼羅盤的刻度上寫著：『此寶藏是由 3個兆、5個億和8個十萬組成的金幣數』，寫成數字是多少？</w:t>
+        <w:t>3. 在弗林特船長留下的藏寶秘記中，寫著他掠奪的西班牙杜布隆金幣與幾尼金幣的總數：由 3個兆、5個億和8個十萬組成。這個金幣數寫成數字是多少？</w:t>
       </w:r>
     </w:p>
     <w:p>
@@ -329,7 +329,7 @@
           <w:color w:val="333333"/>
           <w:sz w:val="22"/>
         </w:rPr>
-        <w:t>4. 水手小傑帶了 500枚銀幣去港口補給，買了 3把每把 25枚銀幣的短刀，和 4包每包 45枚銀幣的乾糧。商船老闆看他是熟客，打折便宜了 10枚銀幣。請問小傑最後還剩下幾枚銀幣？</w:t>
+        <w:t>4. 比利·蓬斯住在『班波提督亭』旅館，他帶了 500英鎊，向旅店老闆買了 3瓶每瓶 25英鎊的朗姆酒，和 4大包每包 45英鎊的乾糧。老闆因為他是長住客，結帳時便宜了 10英鎊。請問比利最後還剩下幾英鎊？</w:t>
       </w:r>
     </w:p>
     <w:p>
@@ -345,7 +345,7 @@
           <w:color w:val="464646"/>
           <w:sz w:val="21"/>
         </w:rPr>
-        <w:t>(A) 235枚</w:t>
+        <w:t>(A) 235英鎊</w:t>
       </w:r>
     </w:p>
     <w:p>
@@ -361,7 +361,7 @@
           <w:color w:val="464646"/>
           <w:sz w:val="21"/>
         </w:rPr>
-        <w:t>(B) 245枚</w:t>
+        <w:t>(B) 245英鎊</w:t>
       </w:r>
     </w:p>
     <w:p>
@@ -377,7 +377,7 @@
           <w:color w:val="464646"/>
           <w:sz w:val="21"/>
         </w:rPr>
-        <w:t>(C) 255枚</w:t>
+        <w:t>(C) 255英鎊</w:t>
       </w:r>
     </w:p>
     <w:p>
@@ -393,7 +393,7 @@
           <w:color w:val="464646"/>
           <w:sz w:val="21"/>
         </w:rPr>
-        <w:t>(D) 265枚</w:t>
+        <w:t>(D) 265英鎊</w:t>
       </w:r>
     </w:p>
     <w:p>
@@ -408,7 +408,7 @@
           <w:color w:val="333333"/>
           <w:sz w:val="22"/>
         </w:rPr>
-        <w:t>5. 海盜們在椰子島上採收了 240個椰子。先剔除壞掉的 15個，其餘的每 15個裝成一箱，運往皇家港口每箱賣 250枚銀幣。如果全部賣完，一共可收入多少枚銀幣？</w:t>
+        <w:t>5. 班·甘恩在金銀島上採集了 240個野生椰子。他剔除了壞掉的 15個，其餘每 15個裝成一箱，準備賣給來訪的『伊斯班紐拉號』船員，每箱賣 250枚西班牙金幣。如果全部賣完，班·甘恩一共可以收入多少枚金幣？</w:t>
       </w:r>
     </w:p>
     <w:p>
@@ -424,7 +424,7 @@
           <w:color w:val="464646"/>
           <w:sz w:val="21"/>
         </w:rPr>
-        <w:t>(A) 3500枚</w:t>
+        <w:t>(A) 3500枚金幣</w:t>
       </w:r>
     </w:p>
     <w:p>
@@ -440,7 +440,7 @@
           <w:color w:val="464646"/>
           <w:sz w:val="21"/>
         </w:rPr>
-        <w:t>(B) 3750枚</w:t>
+        <w:t>(B) 3750枚金幣</w:t>
       </w:r>
     </w:p>
     <w:p>
@@ -456,7 +456,7 @@
           <w:color w:val="464646"/>
           <w:sz w:val="21"/>
         </w:rPr>
-        <w:t>(C) 4000枚</w:t>
+        <w:t>(C) 4000枚金幣</w:t>
       </w:r>
     </w:p>
     <w:p>
@@ -472,7 +472,7 @@
           <w:color w:val="464646"/>
           <w:sz w:val="21"/>
         </w:rPr>
-        <w:t>(D) 56250枚</w:t>
+        <w:t>(D) 56250枚金幣</w:t>
       </w:r>
     </w:p>
     <w:p>
@@ -518,7 +518,7 @@
           <w:color w:val="333333"/>
           <w:sz w:val="22"/>
         </w:rPr>
-        <w:t>6. 兩艘海盜船『黃金鹿號』與『黑珍珠號』的密碼羅盤指針分別指向 36 和 48。要開啟寶藏之門，必須求出這兩個數的最大公因數與最小公倍數。</w:t>
+        <w:t>6. 吉姆發現藏寶圖上標註了兩個關鍵地標『望遠鏡山』與『骷髏山』的加密刻度分別是 36 和 48。若要推算出寶藏大洞的真正位置，必須求出這兩個數的最大公因數與最小公倍數。</w:t>
       </w:r>
     </w:p>
     <w:p>
@@ -597,7 +597,7 @@
           <w:color w:val="333333"/>
           <w:sz w:val="22"/>
         </w:rPr>
-        <w:t>7. 海盜船的廚房裡有 45個蘋果和 60個水梨。廚師想把它們平均裝進儲藏箱裡防潮，每個箱子的蘋果要一樣多，水梨也要一樣多。請問最多可以裝成幾箱？此時每箱有幾個蘋果？</w:t>
+        <w:t>7. 伊斯班紐拉號的廚房裡儲備了 45個蘋果和 60個梨子以防敗血症。獨腳廚師西爾弗想把它們平分裝進木箱中，每箱的蘋果要一樣多，梨子也要一樣多。請問最多可以裝成幾箱？此時每箱有幾個蘋果？</w:t>
       </w:r>
     </w:p>
     <w:p>
@@ -676,7 +676,7 @@
           <w:color w:val="333333"/>
           <w:sz w:val="22"/>
         </w:rPr>
-        <w:t>8. 金銀島有兩座燈塔，甲燈塔每 12分鐘閃爍一次，乙燈塔每 18分鐘閃爍一次。如果早上 7點兩座燈塔同時閃爍，下一次同時閃爍是上午幾點幾分？</w:t>
+        <w:t>8. 金銀島的南北兩端各有一座哨角，甲哨角每 12分鐘吹響一次，乙哨角每 18分鐘吹響一次。如果早上 7點兩哨角同時吹響，下一次同時吹響是上午幾點幾分？</w:t>
       </w:r>
     </w:p>
     <w:p>
@@ -786,7 +786,7 @@
           <w:color w:val="333333"/>
           <w:sz w:val="22"/>
         </w:rPr>
-        <w:t>9. 海盜大副清點水手人數，發現今天有 18/24 的水手值班。請將這個分數約分成最簡分數，並說明做法。</w:t>
+        <w:t>9. 吉姆大約清點了伊斯班紐拉號上的水手，發現 24 名船員中有 18 名是暗中倒戈西爾弗的叛變海盜，叛變人數佔全部船員的 18/24。請把這個分數約分成最簡分數，並說明做法。</w:t>
       </w:r>
     </w:p>
     <w:p>
@@ -850,7 +850,7 @@
           <w:color w:val="464646"/>
           <w:sz w:val="21"/>
         </w:rPr>
-        <w:t>(D) 3/4；分子和分母同乘以 6</w:t>
+        <w:t>(D) 3/4；分子 and 分母同乘以 6</w:t>
       </w:r>
     </w:p>
     <w:p>
@@ -865,7 +865,7 @@
           <w:color w:val="333333"/>
           <w:sz w:val="22"/>
         </w:rPr>
-        <w:t>10. 傑克船長在密碼羅盤上轉動指針，先轉了 5/6 圈，再轉了 3/8 圈。請問指針一共轉了幾圈？</w:t>
+        <w:t>10. 吉姆在海島上探險，第一天往東走了 5/6 哩，第二天往東北走了 3/8 哩。請問吉姆一共走了幾哩？算算看：5/6 + 3/8 = ( )。</w:t>
       </w:r>
     </w:p>
     <w:p>
@@ -881,7 +881,7 @@
           <w:color w:val="464646"/>
           <w:sz w:val="21"/>
         </w:rPr>
-        <w:t>(A) 8/14 圈</w:t>
+        <w:t>(A) 8/14 哩</w:t>
       </w:r>
     </w:p>
     <w:p>
@@ -897,7 +897,7 @@
           <w:color w:val="464646"/>
           <w:sz w:val="21"/>
         </w:rPr>
-        <w:t>(B) 1又5/24 圈</w:t>
+        <w:t>(B) 1又5/24 哩</w:t>
       </w:r>
     </w:p>
     <w:p>
@@ -913,7 +913,7 @@
           <w:color w:val="464646"/>
           <w:sz w:val="21"/>
         </w:rPr>
-        <w:t>(C) 1又7/24 圈</w:t>
+        <w:t>(C) 1又7/24 哩</w:t>
       </w:r>
     </w:p>
     <w:p>
@@ -929,7 +929,7 @@
           <w:color w:val="464646"/>
           <w:sz w:val="21"/>
         </w:rPr>
-        <w:t>(D) 29/14 圈</w:t>
+        <w:t>(D) 29/14 哩</w:t>
       </w:r>
     </w:p>
     <w:p>
@@ -975,7 +975,7 @@
           <w:color w:val="333333"/>
           <w:sz w:val="22"/>
         </w:rPr>
-        <w:t>11. 水手們在甲板上分食 3 塊香噴噴的烤餅，平分給 4 個人，每個人可以分到幾塊烤餅？用分數怎麼表示？</w:t>
+        <w:t>11. 班·甘恩與吉姆等共 4 人在山洞中分食 3 塊烤羊肉，每人分到的烤羊肉要一樣多。請問每個人可以分到幾塊烤羊肉？用分數怎麼表示？</w:t>
       </w:r>
     </w:p>
     <w:p>
@@ -991,7 +991,7 @@
           <w:color w:val="464646"/>
           <w:sz w:val="21"/>
         </w:rPr>
-        <w:t>(A) 1/3 塊</w:t>
+        <w:t>(A) 1/3 塊烤肉</w:t>
       </w:r>
     </w:p>
     <w:p>
@@ -1007,7 +1007,7 @@
           <w:color w:val="464646"/>
           <w:sz w:val="21"/>
         </w:rPr>
-        <w:t>(B) 3/4 塊</w:t>
+        <w:t>(B) 3/4 塊烤肉</w:t>
       </w:r>
     </w:p>
     <w:p>
@@ -1023,7 +1023,7 @@
           <w:color w:val="464646"/>
           <w:sz w:val="21"/>
         </w:rPr>
-        <w:t>(C) 4/3 塊</w:t>
+        <w:t>(C) 4/3 塊烤肉</w:t>
       </w:r>
     </w:p>
     <w:p>
@@ -1039,7 +1039,7 @@
           <w:color w:val="464646"/>
           <w:sz w:val="21"/>
         </w:rPr>
-        <w:t>(D) 1又1/3 塊</w:t>
+        <w:t>(D) 1又1/3 塊烤肉</w:t>
       </w:r>
     </w:p>
     <w:p>
@@ -1054,7 +1054,7 @@
           <w:color w:val="333333"/>
           <w:sz w:val="22"/>
         </w:rPr>
-        <w:t>12. 大副想把 7 加侖的朗姆酒平分裝進 5 個空酒桶中。算式「7 ÷ 5」的商用假分數與帶分數表示，依序是多少？</w:t>
+        <w:t>12. 西爾弗將 7加侖的朗姆酒平均分給 5個忠實的部下。算式「7 ÷ 5」的商用假分數與帶分數表示，依序是多少？</w:t>
       </w:r>
     </w:p>
     <w:p>
@@ -1164,7 +1164,7 @@
           <w:color w:val="333333"/>
           <w:sz w:val="22"/>
         </w:rPr>
-        <w:t>13. 有一瓶神秘淡水有 3/4 公升。小傑喝了這瓶淡水的 2/3，小傑喝了幾公升的淡水？</w:t>
+        <w:t>13. 有一瓶神秘淡水有 3/4 加侖。吉姆口渴喝了這瓶淡水的 2/3，吉姆喝了幾加侖的淡水？</w:t>
       </w:r>
     </w:p>
     <w:p>
@@ -1180,7 +1180,7 @@
           <w:color w:val="464646"/>
           <w:sz w:val="21"/>
         </w:rPr>
-        <w:t>(A) 5/12 公升</w:t>
+        <w:t>(A) 5/12 加侖</w:t>
       </w:r>
     </w:p>
     <w:p>
@@ -1196,7 +1196,7 @@
           <w:color w:val="464646"/>
           <w:sz w:val="21"/>
         </w:rPr>
-        <w:t>(B) 1/2 公升</w:t>
+        <w:t>(B) 1/2 加侖</w:t>
       </w:r>
     </w:p>
     <w:p>
@@ -1212,7 +1212,7 @@
           <w:color w:val="464646"/>
           <w:sz w:val="21"/>
         </w:rPr>
-        <w:t>(C) 9/8 公升</w:t>
+        <w:t>(C) 9/8 加侖</w:t>
       </w:r>
     </w:p>
     <w:p>
@@ -1228,7 +1228,7 @@
           <w:color w:val="464646"/>
           <w:sz w:val="21"/>
         </w:rPr>
-        <w:t>(D) 1又1/12 公升</w:t>
+        <w:t>(D) 1又1/12 加侖</w:t>
       </w:r>
     </w:p>
     <w:p>
@@ -1243,7 +1243,7 @@
           <w:color w:val="333333"/>
           <w:sz w:val="22"/>
         </w:rPr>
-        <w:t>14. 海盜船在順風時每小時航行 1又2/3 浬。如果持續以這個速度航行了 2又1/5 小時，一共航行了幾浬？（算式為：1又2/3 × 2又1/5 = ( )）</w:t>
+        <w:t>14. 伊斯班紐拉號在順風航行時，每小時前進 1又2/3 浬。如果持續以這個速度航行了 2又1/5 小時，一共航行了幾浬？（算式為：1又2/3 × 2又1/5 = ( )）</w:t>
       </w:r>
     </w:p>
     <w:p>
@@ -1353,7 +1353,7 @@
           <w:color w:val="333333"/>
           <w:sz w:val="22"/>
         </w:rPr>
-        <w:t>15. 一袋火藥重 0.25 公斤，大砲發射需要 3.2 袋火藥。請問發射一次共需要幾公斤的火藥？</w:t>
+        <w:t>15. 一包乾糧重 0.25 公斤，吉姆在逃跑時帶了 3.2 包乾糧。請問這些乾糧共重幾公斤？</w:t>
       </w:r>
     </w:p>
     <w:p>
@@ -1432,7 +1432,7 @@
           <w:color w:val="333333"/>
           <w:sz w:val="22"/>
         </w:rPr>
-        <w:t>16. 密碼羅盤的指針指在 4.8 刻度上，需要除以係數 1.2 才能解除陷阱。算算看「4.8 ÷ 1.2 = ( )」，並選出關於小數點移動過程的正確敘述。</w:t>
+        <w:t>16. 吉姆試圖用密碼盤解開比利·蓬斯留下的日誌，指針在 4.8 刻度上，需除以係數 1.2。算算看「4.8 ÷ 1.2 = ( )」，並選出關於小數點移動過程的正確敘述。</w:t>
       </w:r>
     </w:p>
     <w:p>
@@ -1542,7 +1542,7 @@
           <w:color w:val="333333"/>
           <w:sz w:val="22"/>
         </w:rPr>
-        <w:t>17. 傑克船長用黃金偵測器算得金銀島上約有 248915 枚金幣。用四捨五入法把 248915 取概數到萬位是多少？取概數到千位是多少？</w:t>
+        <w:t>17. 弗林特船長埋藏的各國金幣中，法國路易金幣共有 248915 枚。用四捨五入法把 248915 取概數到萬位是多少？取概數到千位是多少？</w:t>
       </w:r>
     </w:p>
     <w:p>
@@ -1621,7 +1621,7 @@
           <w:color w:val="333333"/>
           <w:sz w:val="22"/>
         </w:rPr>
-        <w:t>18. 海盜船的指南針圓周率常數大約是 3.14159。用四捨五入法取到小數第二位（百分位）是多少？</w:t>
+        <w:t>18. 航海士測量伊斯班紐拉號的羅盤偏差常數大約是 3.14159。用四捨五入法取到小數第二位（百分位）是多少？</w:t>
       </w:r>
     </w:p>
     <w:p>
@@ -1731,7 +1731,7 @@
           <w:color w:val="333333"/>
           <w:sz w:val="22"/>
         </w:rPr>
-        <w:t>19. 骷髏島上有 600 個海盜，其中女海盜佔 45%。請問女海盜有多少人？這題的比率是多少？</w:t>
+        <w:t>19. 金銀島附近的港口小鎮共有 600 個居民，其中婦女佔了 45%。請問婦女有多少人？這題的比率是多少？</w:t>
       </w:r>
     </w:p>
     <w:p>
@@ -1810,7 +1810,7 @@
           <w:color w:val="333333"/>
           <w:sz w:val="22"/>
         </w:rPr>
-        <w:t>20. 在藏寶圖上，比例尺是 1 : 50000。已知在圖上兩個寶藏標記之間的距離是 4公分，實際上的距離是多少公里？</w:t>
+        <w:t>20. 在弗林特船長的藏寶圖上，比例尺是 1 : 50000。吉姆量出地圖上比利·蓬斯標記的紅「X」與望遠鏡山山頂的距離是 4公分，實際上的距離是多少公里？</w:t>
       </w:r>
     </w:p>
     <w:p>
@@ -1920,7 +1920,7 @@
           <w:color w:val="333333"/>
           <w:sz w:val="22"/>
         </w:rPr>
-        <w:t>21. 海盜船上的寵物鐵籠裡關著綠鸚鵡和長耳兔共 10 隻。數一數牠們的腳一共有 32 隻。請問籠子裡有幾隻綠鸚鵡？幾隻長耳兔？</w:t>
+        <w:t>21. 班·甘恩在島上馴養了野雞和野兔共 10 隻並關在籠子裡。數一數牠們的腳一共有 32 隻。請問籠子裡有幾隻野雞？幾隻野兔？</w:t>
       </w:r>
     </w:p>
     <w:p>
@@ -1936,7 +1936,7 @@
           <w:color w:val="464646"/>
           <w:sz w:val="21"/>
         </w:rPr>
-        <w:t>(A) 綠鸚鵡有6隻，長耳兔有4隻</w:t>
+        <w:t>(A) 野雞有6隻，野兔有4隻</w:t>
       </w:r>
     </w:p>
     <w:p>
@@ -1952,7 +1952,7 @@
           <w:color w:val="464646"/>
           <w:sz w:val="21"/>
         </w:rPr>
-        <w:t>(B) 綠鸚鵡有5隻，長耳兔有5隻</w:t>
+        <w:t>(B) 野雞有5隻，野兔有5隻</w:t>
       </w:r>
     </w:p>
     <w:p>
@@ -1968,7 +1968,7 @@
           <w:color w:val="464646"/>
           <w:sz w:val="21"/>
         </w:rPr>
-        <w:t>(C) 綠鸚鵡有4隻，長耳兔有6隻</w:t>
+        <w:t>(C) 野雞有4隻，野兔有6隻</w:t>
       </w:r>
     </w:p>
     <w:p>
@@ -1984,7 +1984,7 @@
           <w:color w:val="464646"/>
           <w:sz w:val="21"/>
         </w:rPr>
-        <w:t>(D) 綠鸚鵡有3隻，長耳兔有7隻</w:t>
+        <w:t>(D) 野雞有3隻，野兔有7隻</w:t>
       </w:r>
     </w:p>
     <w:p>
@@ -1999,7 +1999,7 @@
           <w:color w:val="333333"/>
           <w:sz w:val="22"/>
         </w:rPr>
-        <w:t>22. 老船長今年 42 歲，見習小水手今年 12 歲。幾年後，老船長的年齡會剛好是小水手的 3 倍？</w:t>
+        <w:t>22. 鄉紳特里勞尼今年 42 歲，吉姆今年 12 歲。幾年後，鄉紳的年齡會剛好是吉姆的 3 倍？</w:t>
       </w:r>
     </w:p>
     <w:p>
@@ -2109,7 +2109,7 @@
           <w:color w:val="333333"/>
           <w:sz w:val="22"/>
         </w:rPr>
-        <w:t>23. 傑克船長獲得了皇家特許狀，分封了 3公頃 的海島土地。請問 3公頃 = （）公畝 = （）平方公尺。</w:t>
+        <w:t>23. 弗林特船長在遺囑中提到，要把金銀島上 3公頃 的森林地分給大副比利。請問 3公頃 = （）公畝 = （）平方公尺。</w:t>
       </w:r>
     </w:p>
     <w:p>
@@ -2188,7 +2188,7 @@
           <w:color w:val="333333"/>
           <w:sz w:val="22"/>
         </w:rPr>
-        <w:t>24. 海盜們佔領了一塊長方形的海邊沙灘，長是 500公尺，寬是 400公尺。這塊沙灘的面積是多少公頃？也就是幾平方公里？</w:t>
+        <w:t>24. 班·甘恩用石頭圍了一塊長方形的羊圈，長是 500公尺，寬是 400公尺。這塊羊圈的面積是多少公頃？也就是幾平方公里？</w:t>
       </w:r>
     </w:p>
     <w:p>
@@ -2298,7 +2298,7 @@
           <w:color w:val="333333"/>
           <w:sz w:val="22"/>
         </w:rPr>
-        <w:t>25. 海盜船在貨艙底擺放水箱，水箱的容量計算需要單位換算：一立方公尺是多少立方公分？一公升是多少立方公分？</w:t>
+        <w:t>25. 伊斯班紐拉號上的淡水儲藏鐵箱，其體積與容量需要換算：一立方公尺是多少立方公分？一公升是多少立方公分？</w:t>
       </w:r>
     </w:p>
     <w:p>
@@ -2377,7 +2377,7 @@
           <w:color w:val="333333"/>
           <w:sz w:val="22"/>
         </w:rPr>
-        <w:t>26. 傑克船長得到一個用來保存古代海圖的無蓋長方體黃金箱，外面的長寬高分別是 22公分、12公分和 11公分，壁厚是 1公分。這個箱子的容積是多少立方公分？可以裝多少毫升的聖水？</w:t>
+        <w:t>26. 吉姆在比利·蓬斯的水手衣物箱裡找到一個無蓋木盒，外面的長寬高分別是 22公分、12公分和 11公分，壁厚是 1公分。這個木盒的容積是多少立方公分？可以裝多少毫升的淡水？</w:t>
       </w:r>
     </w:p>
     <w:p>
@@ -2487,7 +2487,7 @@
           <w:color w:val="333333"/>
           <w:sz w:val="22"/>
         </w:rPr>
-        <w:t>27. 海盜祭司的水晶祭壇是一個五角柱。請問這個五角柱一共有幾個面？幾條邊？幾個頂點？</w:t>
+        <w:t>27. 班·甘恩在東北方山洞裡，將黃金金條碼成了一個五角柱形狀。請問這個五角柱一共有幾個面？幾條邊？幾個頂點？</w:t>
       </w:r>
     </w:p>
     <w:p>
@@ -2566,7 +2566,7 @@
           <w:color w:val="333333"/>
           <w:sz w:val="22"/>
         </w:rPr>
-        <w:t>28. 藏寶地宮的頂部設計成一個六角錐石雕。請問這個六角錐一共有幾個面？幾條邊？幾個頂點？</w:t>
+        <w:t>28. 金銀島上的老海盜祭壇殘留著一個六角錐石柱。請問這個六角錐一共有幾個面？幾條邊？幾個頂點？</w:t>
       </w:r>
     </w:p>
     <w:p>
@@ -2676,7 +2676,7 @@
           <w:color w:val="333333"/>
           <w:sz w:val="22"/>
         </w:rPr>
-        <w:t>29. 水手們在慶祝航行順利時切分一個圓形水果派，切出一個 120度圓心角的扇形給船長。這個扇形水果派是幾分之幾圓？</w:t>
+        <w:t>29. 水手們在伊斯班紐拉號上慶祝平安抵達，切分一個圓形麵包，切出一個 120度圓心角的扇形給吉姆。這個扇形麵包是幾分之幾圓？</w:t>
       </w:r>
     </w:p>
     <w:p>
@@ -2755,7 +2755,7 @@
           <w:color w:val="333333"/>
           <w:sz w:val="22"/>
         </w:rPr>
-        <w:t>30. 黃金解密羅盤的半徑是 12公分，其中一個代表『東北方位』的 1/4圓扇形區域。請問這個扇形區域的圓心角是多少度？面積是多少平方公分？（圓周率以 3.14 計算）</w:t>
+        <w:t>30. 弗林特船長的密碼羅盤半徑是 12公分，其中一個指向寶藏入口的 1/4圓扇形區域。請問這個扇形區域的圓心角是多少度？面積是多少平方公分？（圓周率以 3.14 計算）</w:t>
       </w:r>
     </w:p>
     <w:p>
@@ -2865,7 +2865,7 @@
           <w:color w:val="333333"/>
           <w:sz w:val="22"/>
         </w:rPr>
-        <w:t>31. 海盜們在椰子島上開墾了一塊底 15公尺、高 8公尺的平行四邊形菜地。這塊菜地的面積是多少平方公尺？</w:t>
+        <w:t>31. 吉姆和夥伴們在金銀島上搭建了一間底 15公尺、高 8公尺的平行四邊形臨時木屋。這間木屋的佔地面積是多少平方公尺？</w:t>
       </w:r>
     </w:p>
     <w:p>
@@ -2944,7 +2944,7 @@
           <w:color w:val="333333"/>
           <w:sz w:val="22"/>
         </w:rPr>
-        <w:t>32. 海盜船桅杆上掛著一面三角形骷髏旗，底是 12公寸，面積是 48平方公寸。這面旗子的高是多少公寸？</w:t>
+        <w:t>32. 伊斯班紐拉號上掛著一面三角形的英國國旗，底是 12公寸，面積是 48平方公寸。這面旗子的高是多少公寸？</w:t>
       </w:r>
     </w:p>
     <w:p>
@@ -3054,7 +3054,7 @@
           <w:color w:val="333333"/>
           <w:sz w:val="22"/>
         </w:rPr>
-        <w:t>33. 海盜們用來存放火藥的長方體鐵盒，長 10公分、寬 6公分、高 5公分。它的表面積和體積各是多少？</w:t>
+        <w:t>33. 比利·蓬斯收藏祕密地圖的長方體鐵盒，長 10公分、寬 6公分、高 5公分。它的表面積和體積各是多少？</w:t>
       </w:r>
     </w:p>
     <w:p>
@@ -3133,7 +3133,7 @@
           <w:color w:val="333333"/>
           <w:sz w:val="22"/>
         </w:rPr>
-        <w:t>34. 水手小傑在甲板上找到一個正方體木箱，邊長是 8公寸。它的表面積和體積各是多少？</w:t>
+        <w:t>34. 吉姆在伊斯班紐拉號的貨艙找到一個正方體彈藥箱，邊長是 8公寸。它的表面積和體積各是多少？</w:t>
       </w:r>
     </w:p>
     <w:p>
@@ -3243,7 +3243,7 @@
           <w:color w:val="333333"/>
           <w:sz w:val="22"/>
         </w:rPr>
-        <w:t>35. 航海用的三角板是一個等腰三角形。已知它的頂角是 50度，那它的兩個底角各是多少度？</w:t>
+        <w:t>35. 吉姆用來繪製海島航線的三角板是一個等腰三角形。已知它的頂角是 50度，那它的兩個底角各是多少度？</w:t>
       </w:r>
     </w:p>
     <w:p>
@@ -3322,7 +3322,7 @@
           <w:color w:val="333333"/>
           <w:sz w:val="22"/>
         </w:rPr>
-        <w:t>36. 海盜船上的四邊形甲板，其內角和是多少度？我們可以用什麼簡單的方法，把四邊形切開來證明？</w:t>
+        <w:t>36. 伊斯班紐拉號上的四邊形船尾甲板，其內角和是多少度？我們可以用什麼簡單的方法，把四邊形切開來證明？</w:t>
       </w:r>
     </w:p>
     <w:p>
@@ -3432,7 +3432,7 @@
           <w:color w:val="333333"/>
           <w:sz w:val="22"/>
         </w:rPr>
-        <w:t>37. 傑克船長在研究骷髏旗標誌時，大副提到它是個『線對稱圖形』。請問什麼是『線對稱圖形』？請選出一個生活中的線對稱圖形例子。</w:t>
+        <w:t>37. 西爾弗在研究海盜骷髏旗時，吉姆提到骷髏圖案是個『線對稱圖形』。請問什麼是『線對稱圖形』？請選出一個生活中的線對稱圖形例子。</w:t>
       </w:r>
     </w:p>
     <w:p>
@@ -3511,7 +3511,7 @@
           <w:color w:val="333333"/>
           <w:sz w:val="22"/>
         </w:rPr>
-        <w:t>38. 船長拿著三種不同形狀的藏寶地圖碎片：等腰三角形、正方形與圓形。請問它們一共有幾條對稱軸？</w:t>
+        <w:t>38. 吉姆拿著三張不同形狀的地圖殘片：等腰三角形、正方形與圓形。請問它們一共有幾條對稱軸？</w:t>
       </w:r>
     </w:p>
     <w:p>
@@ -3621,7 +3621,7 @@
           <w:color w:val="333333"/>
           <w:sz w:val="22"/>
         </w:rPr>
-        <w:t>39. 海盜探險隊用放大鏡觀察地圖上一個三角形海灣標記，各邊長變為原來的 3倍。這是一個什麼圖？它的每個內角度數會變為原來的幾倍？</w:t>
+        <w:t>39. 吉姆用放大鏡觀察藏寶圖上一個三角形的『骷髏山』標記，各邊長變為原來的 3倍。這是一個什麼圖？它的每個內角度數會變為原來的幾倍？</w:t>
       </w:r>
     </w:p>
     <w:p>
@@ -3700,7 +3700,7 @@
           <w:color w:val="333333"/>
           <w:sz w:val="22"/>
         </w:rPr>
-        <w:t>40. 航海士把長 10公分、寬 6公分的長方形船艙設計圖，縮小為 1/2 倍的縮小圖印在手冊上。這張縮小圖的長、寬和面積各是多少？</w:t>
+        <w:t>40. 船長把長 10公分、寬 6公分的長方形伊斯班紐拉號艙位圖，縮小為 1/2 倍繪製在筆記本上。這張縮小圖的長、寬和面積各是多少？</w:t>
       </w:r>
     </w:p>
     <w:p>
@@ -3810,7 +3810,7 @@
           <w:color w:val="333333"/>
           <w:sz w:val="22"/>
         </w:rPr>
-        <w:t>41. 海盜分發戰利品，每人分得 35 枚金幣，一共有 99 人。算算看，怎麼算最快？ 99 × 35 = ( )。你運用了什麼計算規則？</w:t>
+        <w:t>41. 弗林特船長給水手們發放獎勵，每人分得 35 枚西班牙金幣，一共有 99 人。算算看，怎麼算最快？ 99 × 35 = ( )。你運用了什麼計算規則？</w:t>
       </w:r>
     </w:p>
     <w:p>
@@ -3889,7 +3889,7 @@
           <w:color w:val="333333"/>
           <w:sz w:val="22"/>
         </w:rPr>
-        <w:t>42. 密碼羅盤的兩組刻度公式分別是 3.8 × 4.2 和 6.2 × 4.2，相加即為解密鑰匙。算算看，怎麼算最快？ 3.8 × 4.2 + 6.2 × 4.2 = ( )。</w:t>
+        <w:t>42. 密碼羅盤的解密指針公式分別是 3.8 × 4.2 和 6.2 × 4.2，相加即為解密鎖的密碼。算算看，怎麼算最快？ 3.8 × 4.2 + 6.2 × 4.2 = ( )。</w:t>
       </w:r>
     </w:p>
     <w:p>
@@ -3999,7 +3999,7 @@
           <w:color w:val="333333"/>
           <w:sz w:val="22"/>
         </w:rPr>
-        <w:t>43. 大副調配魔法淡水，先加入了 3/4 公升，又加入了 1.25 × 2 公升。算算看： 3/4 + 1.25 × 2 = ( )。分數與小數混合時怎麼計算？</w:t>
+        <w:t>43. 醫生李甫西在調配藥劑時，先加入了 3/4 加侖的淨水，又加入了 1.25 × 2 加侖的藥液。算算看： 3/4 + 1.25 × 2 = ( )。分數與小數混合時怎麼計算？</w:t>
       </w:r>
     </w:p>
     <w:p>
@@ -4078,7 +4078,7 @@
           <w:color w:val="333333"/>
           <w:sz w:val="22"/>
         </w:rPr>
-        <w:t>44. 傑克船長在解鎖黃金門鎖時，需要計算羅盤上的公式： (2.4 - 1.2) ÷ 3/5 = ( )。請算算看結果是多少？</w:t>
+        <w:t>44. 吉姆試圖用公式解鎖班·甘恩在山洞中擺放的羅盤鎖： (2.4 - 1.2) ÷ 3/5 = ( )。請算算看結果是多少？</w:t>
       </w:r>
     </w:p>
     <w:p>
@@ -4188,7 +4188,7 @@
           <w:color w:val="333333"/>
           <w:sz w:val="22"/>
         </w:rPr>
-        <w:t>45. 傑克船長的年齡比大副大 4 歲。如果用 x 表示傑克船長的年齡，大副的年齡要怎麼表示？</w:t>
+        <w:t>45. 醫生李甫西的年齡比大副比利·蓬斯大 4 歲。如果用 x 表示醫生的年齡，比利的年齡要怎麼表示？</w:t>
       </w:r>
     </w:p>
     <w:p>
@@ -4267,7 +4267,7 @@
           <w:color w:val="333333"/>
           <w:sz w:val="22"/>
         </w:rPr>
-        <w:t>46. 港口鐵匠舖的一把火槍賣 x 枚銀幣，海盜小傑買了 3 把，付了 500 枚銀幣。老闆要找回他多少枚銀幣？用含有 x 的算式表述。</w:t>
+        <w:t>46. 港口的一把佩劍賣 x 枚銀幣，吉姆買了 3 把，付了 500 枚銀幣。商家要找回他多少枚銀幣？用含有 x 的算式表述。</w:t>
       </w:r>
     </w:p>
     <w:p>
@@ -4377,7 +4377,7 @@
           <w:color w:val="333333"/>
           <w:sz w:val="22"/>
         </w:rPr>
-        <w:t>47. 海盜船上的藏書室有各種地圖與書籍，圓形百分圖顯示：航海誌佔 40%、天文書佔 30%、冒險小說佔 20%、其他佔 10%。如果一共有 200本書，航海誌有幾本？</w:t>
+        <w:t>47. 伊斯班紐拉號上的圖書櫃有各種航海書籍，圓形百分圖中顯示：航海誌佔 40%、天文與氣象書佔 30%、地理圖冊佔 20%、其他佔 10%。如果一共有 200本書，航海誌有幾本？</w:t>
       </w:r>
     </w:p>
     <w:p>
@@ -4456,7 +4456,7 @@
           <w:color w:val="333333"/>
           <w:sz w:val="22"/>
         </w:rPr>
-        <w:t>48. 舵手想在圓形舵盤上塗上顏色，代表 25% 的『安全轉向區』。在圓形圖上，這個區域的圓心角應該是多少度？</w:t>
+        <w:t>48. 吉姆想在伊斯班紐拉號的圓形舵盤上畫出一個代表 25% 的『安全轉向舵角區』。在圓形圖上，這個區域的圓心角應該是多少度？</w:t>
       </w:r>
     </w:p>
     <w:p>
@@ -4566,7 +4566,7 @@
           <w:color w:val="333333"/>
           <w:sz w:val="22"/>
         </w:rPr>
-        <w:t>49. 海盜們玩摸球遊戲，袋子裡放了 8顆黑珍珠和 2顆白珍珠。不看袋子摸出一顆，摸到黑珍珠的可能性大還是白珍珠大？為什麼？</w:t>
+        <w:t>49. 班·甘恩把 8 顆黑石子和 2 顆白石子放進袋子裡。吉姆不看袋子摸出一顆石子，摸到黑石子的可能性大還是白石子大？為什麼？</w:t>
       </w:r>
     </w:p>
     <w:p>
@@ -4582,7 +4582,7 @@
           <w:color w:val="464646"/>
           <w:sz w:val="21"/>
         </w:rPr>
-        <w:t>(A) 白珍珠大；因為白珍珠比較顯眼</w:t>
+        <w:t>(A) 白石子大；因為白石子比較顯眼</w:t>
       </w:r>
     </w:p>
     <w:p>
@@ -4598,7 +4598,7 @@
           <w:color w:val="464646"/>
           <w:sz w:val="21"/>
         </w:rPr>
-        <w:t>(B) 黑珍珠大；因為黑珍珠數量比較多</w:t>
+        <w:t>(B) 黑石子大；因為黑石子數量比較多</w:t>
       </w:r>
     </w:p>
     <w:p>
@@ -4645,7 +4645,7 @@
           <w:color w:val="333333"/>
           <w:sz w:val="22"/>
         </w:rPr>
-        <w:t>50. 大副和二副在甲板上玩骨牌遊戲，丟一個公正的骰子（點數1~6），丟出奇數點和偶數點的可能性一樣大嗎？為什麼？</w:t>
+        <w:t>50. 西爾弗和船員們在甲板上玩擲骰子遊戲，丟一個公正的骰子（點數1~6），丟出奇數點和偶數點的可能性一樣大嗎？為什麼？</w:t>
       </w:r>
     </w:p>
     <w:p>

</xml_diff>

<commit_message>
Enclose characters and location names in quotes
</commit_message>
<xml_diff>
--- a/第三學習階段遊戲題庫.docx
+++ b/第三學習階段遊戲題庫.docx
@@ -61,7 +61,7 @@
           <w:color w:val="333333"/>
           <w:sz w:val="22"/>
         </w:rPr>
-        <w:t>1. 弗林特船長在金銀島上埋藏了巨大的財富。大副比利·蓬斯在手記中記載：『若要開鎖，需解開十進位的秘密：一兆是幾個一億？一億是幾個一萬？』請幫忙解開這個謎題。</w:t>
+        <w:t>1. 「弗林特」船長在「金銀島」上埋藏了巨大的財富。大副「比利·蓬斯」在手記中記載：『若要開鎖，需解開十進位的秘密：一兆是幾個一億？一億是幾個一萬？』請幫忙解開這個謎題。</w:t>
       </w:r>
     </w:p>
     <w:p>
@@ -140,7 +140,7 @@
           <w:color w:val="333333"/>
           <w:sz w:val="22"/>
         </w:rPr>
-        <w:t>2. 少年吉姆在比利·蓬斯的水手衣物箱底發現了一張古老航海圖，角落用極小的紅墨水標記著一個小數「0.0075」。請問這個數讀作什麼？其中的「7」和「5」分別在什麼位數？</w:t>
+        <w:t>2. 少年「吉姆」在「比利·蓬斯」的水手衣物箱底發現了一張古老航海圖，角落用極小的紅墨水標記著一個小數「0.0075」。請問這個數讀作什麼？其中的「7」和「5」分別在什麼位數？</w:t>
       </w:r>
     </w:p>
     <w:p>
@@ -219,7 +219,7 @@
           <w:color w:val="333333"/>
           <w:sz w:val="22"/>
         </w:rPr>
-        <w:t>3. 在弗林特船長留下的藏寶秘記中，寫著他掠奪的西班牙杜布隆金幣與幾尼金幣的總數：由 3個兆、5個億和8個十萬組成。這個金幣數寫成數字是多少？</w:t>
+        <w:t>3. 在「弗林特」船長留下的藏寶秘記中，寫著他掠奪的西班牙「杜布隆」金幣與「幾尼」金幣的總數：由 3個兆、5個億和8個十萬組成。這個金幣數寫成數字是多少？</w:t>
       </w:r>
     </w:p>
     <w:p>
@@ -329,7 +329,7 @@
           <w:color w:val="333333"/>
           <w:sz w:val="22"/>
         </w:rPr>
-        <w:t>4. 比利·蓬斯住在『班波提督亭』旅館，他帶了 500英鎊，向旅店老闆買了 3瓶每瓶 25英鎊的朗姆酒，和 4大包每包 45英鎊的乾糧。老闆因為他是長住客，結帳時便宜了 10英鎊。請問比利最後還剩下幾英鎊？</w:t>
+        <w:t>4. 「比利·蓬斯」住在「班波提督亭」旅館，他帶了 500英鎊，向旅店老闆買了 3瓶每瓶 25英鎊的朗姆酒，和 4大包每包 45英鎊的乾糧。老闆因為他是長住客，結帳時便宜了 10英鎊。請問「比利」最後還剩下幾英鎊？</w:t>
       </w:r>
     </w:p>
     <w:p>
@@ -408,7 +408,7 @@
           <w:color w:val="333333"/>
           <w:sz w:val="22"/>
         </w:rPr>
-        <w:t>5. 班·甘恩在金銀島上採集了 240個野生椰子。他剔除了壞掉的 15個，其餘每 15個裝成一箱，準備賣給來訪的『伊斯班紐拉號』船員，每箱賣 250枚西班牙金幣。如果全部賣完，班·甘恩一共可以收入多少枚金幣？</w:t>
+        <w:t>5. 「班·甘恩」在「金銀島」上採集了 240個野生椰子。他剔除了壞掉的 15個，其餘每 15個裝成一箱，準備賣給來訪的「伊斯班紐拉號」船員，每箱賣 250枚西班牙金幣。如果全部賣完，「班·甘恩」一共可以收入多少枚金幣？</w:t>
       </w:r>
     </w:p>
     <w:p>
@@ -518,7 +518,7 @@
           <w:color w:val="333333"/>
           <w:sz w:val="22"/>
         </w:rPr>
-        <w:t>6. 吉姆發現藏寶圖上標註了兩個關鍵地標『望遠鏡山』與『骷髏山』的加密刻度分別是 36 和 48。若要推算出寶藏大洞的真正位置，必須求出這兩個數的最大公因數與最小公倍數。</w:t>
+        <w:t>6. 「吉姆」發現藏寶圖上標註了兩個關鍵地標「望遠鏡山」與「骷髏山」的加密刻度分別是 36 和 48。若要推算出寶藏大洞的真正位置，必須求出這兩個數的最大公因數與最小公倍數。</w:t>
       </w:r>
     </w:p>
     <w:p>
@@ -597,7 +597,7 @@
           <w:color w:val="333333"/>
           <w:sz w:val="22"/>
         </w:rPr>
-        <w:t>7. 伊斯班紐拉號的廚房裡儲備了 45個蘋果和 60個梨子以防敗血症。獨腳廚師西爾弗想把它們平分裝進木箱中，每箱的蘋果要一樣多，梨子也要一樣多。請問最多可以裝成幾箱？此時每箱有幾個蘋果？</w:t>
+        <w:t>7. 「伊斯班紐拉號」的廚房裡儲備了 45個蘋果 and 60個梨子以防敗血症。獨腳廚師「西爾弗」想把它們平分裝進木箱中，每箱的蘋果要一樣多，梨子也要一樣多。請問最多可以裝成幾箱？此時每箱有幾個蘋果？</w:t>
       </w:r>
     </w:p>
     <w:p>
@@ -676,7 +676,7 @@
           <w:color w:val="333333"/>
           <w:sz w:val="22"/>
         </w:rPr>
-        <w:t>8. 金銀島的南北兩端各有一座哨角，甲哨角每 12分鐘吹響一次，乙哨角每 18分鐘吹響一次。如果早上 7點兩哨角同時吹響，下一次同時吹響是上午幾點幾分？</w:t>
+        <w:t>8. 「金銀島」的南北兩端各有一座哨角，甲哨角每 12分鐘吹響一次，乙哨角每 18分鐘吹響一次。如果早上 7點兩哨角同時吹響，下一次同時吹響是上午幾點幾分？</w:t>
       </w:r>
     </w:p>
     <w:p>
@@ -786,7 +786,7 @@
           <w:color w:val="333333"/>
           <w:sz w:val="22"/>
         </w:rPr>
-        <w:t>9. 吉姆大約清點了伊斯班紐拉號上的水手，發現 24 名船員中有 18 名是暗中倒戈西爾弗的叛變海盜，叛變人數佔全部船員的 18/24。請把這個分數約分成最簡分數，並說明做法。</w:t>
+        <w:t>9. 「吉姆」大約清點了「伊斯班紐拉號」上的水手，發現 24 名船員中有 18 名是暗中倒戈「西爾弗」的叛變海盜，叛變人數佔全部船員的 18/24。請把這個分數約分成最簡分數，並說明做法。</w:t>
       </w:r>
     </w:p>
     <w:p>
@@ -850,7 +850,7 @@
           <w:color w:val="464646"/>
           <w:sz w:val="21"/>
         </w:rPr>
-        <w:t>(D) 3/4；分子 and 分母同乘以 6</w:t>
+        <w:t>(D) 3/4；分子和分母同乘以 6</w:t>
       </w:r>
     </w:p>
     <w:p>
@@ -865,7 +865,7 @@
           <w:color w:val="333333"/>
           <w:sz w:val="22"/>
         </w:rPr>
-        <w:t>10. 吉姆在海島上探險，第一天往東走了 5/6 哩，第二天往東北走了 3/8 哩。請問吉姆一共走了幾哩？算算看：5/6 + 3/8 = ( )。</w:t>
+        <w:t>10. 「吉姆」在「金銀島」上探險，第一天往東走了 5/6 哩，第二天往東北走了 3/8 哩。請問「吉姆」一共走了幾哩？算算看：5/6 + 3/8 = ( )。</w:t>
       </w:r>
     </w:p>
     <w:p>
@@ -975,7 +975,7 @@
           <w:color w:val="333333"/>
           <w:sz w:val="22"/>
         </w:rPr>
-        <w:t>11. 班·甘恩與吉姆等共 4 人在山洞中分食 3 塊烤羊肉，每人分到的烤羊肉要一樣多。請問每個人可以分到幾塊烤羊肉？用分數怎麼表示？</w:t>
+        <w:t>11. 「班·甘恩」與「吉姆」等共 4 人在山洞中分食 3 塊烤羊肉，每人分到的烤羊肉要一樣多。請問每個人可以分到幾塊烤羊肉？用分數怎麼表示？</w:t>
       </w:r>
     </w:p>
     <w:p>
@@ -1054,7 +1054,7 @@
           <w:color w:val="333333"/>
           <w:sz w:val="22"/>
         </w:rPr>
-        <w:t>12. 西爾弗將 7加侖的朗姆酒平均分給 5個忠實的部下。算式「7 ÷ 5」的商用假分數與帶分數表示，依序是多少？</w:t>
+        <w:t>12. 「西爾弗」將 7加侖的朗姆酒平均分給 5個忠實的部下。算算看「7 ÷ 5」，並求其假分數與帶分數商值。</w:t>
       </w:r>
     </w:p>
     <w:p>
@@ -1164,7 +1164,7 @@
           <w:color w:val="333333"/>
           <w:sz w:val="22"/>
         </w:rPr>
-        <w:t>13. 有一瓶神秘淡水有 3/4 加侖。吉姆口渴喝了這瓶淡水的 2/3，吉姆喝了幾加侖的淡水？</w:t>
+        <w:t>13. 「伊斯班紐拉號」上的淡水桶中僅存 3/4 加侖的水。「吉姆」口渴喝了這瓶淡水的 2/3，請問「吉姆」喝了幾加侖的淡水？</w:t>
       </w:r>
     </w:p>
     <w:p>
@@ -1243,7 +1243,7 @@
           <w:color w:val="333333"/>
           <w:sz w:val="22"/>
         </w:rPr>
-        <w:t>14. 伊斯班紐拉號在順風航行時，每小時前進 1又2/3 浬。如果持續以這個速度航行了 2又1/5 小時，一共航行了幾浬？（算式為：1又2/3 × 2又1/5 = ( )）</w:t>
+        <w:t>14. 「伊斯班紐拉號」在順風航行時，每小時前進 1又2/3 浬。如果持續以這個速度航行了 2又1/5 小時，一共航行了幾浬？（算式為：1又2/3 × 2又1/5 = ( )）</w:t>
       </w:r>
     </w:p>
     <w:p>
@@ -1353,7 +1353,7 @@
           <w:color w:val="333333"/>
           <w:sz w:val="22"/>
         </w:rPr>
-        <w:t>15. 一包乾糧重 0.25 公斤，吉姆在逃跑時帶了 3.2 包乾糧。請問這些乾糧共重幾公斤？</w:t>
+        <w:t>15. 一包乾糧重 0.25 公斤，「吉姆」在逃跑時帶了 3.2 包乾糧。請問這些乾糧共重幾公斤？</w:t>
       </w:r>
     </w:p>
     <w:p>
@@ -1432,7 +1432,7 @@
           <w:color w:val="333333"/>
           <w:sz w:val="22"/>
         </w:rPr>
-        <w:t>16. 吉姆試圖用密碼盤解開比利·蓬斯留下的日誌，指針在 4.8 刻度上，需除以係數 1.2。算算看「4.8 ÷ 1.2 = ( )」，並選出關於小數點移動過程的正確敘述。</w:t>
+        <w:t>16. 「吉姆」試圖用密碼盤解開「比利·蓬斯」留下的日誌，指針在 4.8 刻度上，需除以係數 1.2。算算看「4.8 ÷ 1.2 = ( )」，並選出關於小數點移動過程的正確敘述。</w:t>
       </w:r>
     </w:p>
     <w:p>
@@ -1496,7 +1496,7 @@
           <w:color w:val="464646"/>
           <w:sz w:val="21"/>
         </w:rPr>
-        <w:t>(D) 40；除數小數點往右移兩位，被除數往右移一位</w:t>
+        <w:t>(D) 40；除數小數點往右移帶兩位，被除數往右移一位</w:t>
       </w:r>
     </w:p>
     <w:p>
@@ -1542,7 +1542,7 @@
           <w:color w:val="333333"/>
           <w:sz w:val="22"/>
         </w:rPr>
-        <w:t>17. 弗林特船長埋藏的各國金幣中，法國路易金幣共有 248915 枚。用四捨五入法把 248915 取概數到萬位是多少？取概數到千位是多少？</w:t>
+        <w:t>17. 「弗林特」船長埋藏的各國金幣中，法國路易金幣共有 248915 枚。用四捨五入法把 248915 取概數到萬位是多少？取概數到千位是多少？</w:t>
       </w:r>
     </w:p>
     <w:p>
@@ -1621,7 +1621,7 @@
           <w:color w:val="333333"/>
           <w:sz w:val="22"/>
         </w:rPr>
-        <w:t>18. 航海士測量伊斯班紐拉號的羅盤偏差常數大約是 3.14159。用四捨五入法取到小數第二位（百分位）是多少？</w:t>
+        <w:t>18. 航海士測量「伊斯班紐拉號」的羅盤偏差常數大約是 3.14159。用四捨五入法取到小數第二位（百分位）是多少？</w:t>
       </w:r>
     </w:p>
     <w:p>
@@ -1731,7 +1731,7 @@
           <w:color w:val="333333"/>
           <w:sz w:val="22"/>
         </w:rPr>
-        <w:t>19. 金銀島附近的港口小鎮共有 600 個居民，其中婦女佔了 45%。請問婦女有多少人？這題的比率是多少？</w:t>
+        <w:t>19. 「金銀島」附近的港口小鎮共有 600 個居民，其中婦女佔了 45%。請問婦女有多少人？這題的比率是多少？</w:t>
       </w:r>
     </w:p>
     <w:p>
@@ -1810,7 +1810,7 @@
           <w:color w:val="333333"/>
           <w:sz w:val="22"/>
         </w:rPr>
-        <w:t>20. 在弗林特船長的藏寶圖上，比例尺是 1 : 50000。吉姆量出地圖上比利·蓬斯標記的紅「X」與望遠鏡山山頂的距離是 4公分，實際上的距離是多少公里？</w:t>
+        <w:t>20. 在「弗林特」船長的藏寶圖上，比例尺是 1 : 50000。「吉姆」量出地圖上「比利·蓬斯」標記的紅「X」與「望遠鏡山」山頂的距離是 4公分，實際上的距離是多少公里？</w:t>
       </w:r>
     </w:p>
     <w:p>
@@ -1920,7 +1920,7 @@
           <w:color w:val="333333"/>
           <w:sz w:val="22"/>
         </w:rPr>
-        <w:t>21. 班·甘恩在島上馴養了野雞和野兔共 10 隻並關在籠子裡。數一數牠們的腳一共有 32 隻。請問籠子裡有幾隻野雞？幾隻野兔？</w:t>
+        <w:t>21. 「班·甘恩」在島上馴養了野雞和野兔共 10 隻並關在籠子裡。數一數牠們的腳一共有 32 隻。請問籠子裡有幾隻野雞？幾隻野兔？</w:t>
       </w:r>
     </w:p>
     <w:p>
@@ -1999,7 +1999,7 @@
           <w:color w:val="333333"/>
           <w:sz w:val="22"/>
         </w:rPr>
-        <w:t>22. 鄉紳特里勞尼今年 42 歲，吉姆今年 12 歲。幾年後，鄉紳的年齡會剛好是吉姆的 3 倍？</w:t>
+        <w:t>22. 鄉紳「特里勞尼」今年 42 歲，「吉姆」今年 12 歲。幾年後，鄉紳的年齡會剛好是「吉姆」的 3 倍？</w:t>
       </w:r>
     </w:p>
     <w:p>
@@ -2109,7 +2109,7 @@
           <w:color w:val="333333"/>
           <w:sz w:val="22"/>
         </w:rPr>
-        <w:t>23. 弗林特船長在遺囑中提到，要把金銀島上 3公頃 的森林地分給大副比利。請問 3公頃 = （）公畝 = （）平方公尺。</w:t>
+        <w:t>23. 「弗林特」船長在遺囑中提到，要把「金銀島」上 3公頃 的森林地分給大副「比利」。請問 3公頃 = （）公畝 = （）平方公尺。</w:t>
       </w:r>
     </w:p>
     <w:p>
@@ -2188,7 +2188,7 @@
           <w:color w:val="333333"/>
           <w:sz w:val="22"/>
         </w:rPr>
-        <w:t>24. 班·甘恩用石頭圍了一塊長方形的羊圈，長是 500公尺，寬是 400公尺。這塊羊圈的面積是多少公頃？也就是幾平方公里？</w:t>
+        <w:t>24. 「班·甘恩」用石頭圍了一塊長方形的羊圈，長是 500公尺，寬是 400公尺。這塊羊圈的面積是多少公頃？也就是幾平方公里？</w:t>
       </w:r>
     </w:p>
     <w:p>
@@ -2298,7 +2298,7 @@
           <w:color w:val="333333"/>
           <w:sz w:val="22"/>
         </w:rPr>
-        <w:t>25. 伊斯班紐拉號上的淡水儲藏鐵箱，其體積與容量需要換算：一立方公尺是多少立方公分？一公升是多少立方公分？</w:t>
+        <w:t>25. 「伊斯班紐拉號」上的淡水儲藏鐵箱，其體積與容量需要換算：一立方公尺是多少立方公分？一公升是多少立方公分？</w:t>
       </w:r>
     </w:p>
     <w:p>
@@ -2377,7 +2377,7 @@
           <w:color w:val="333333"/>
           <w:sz w:val="22"/>
         </w:rPr>
-        <w:t>26. 吉姆在比利·蓬斯的水手衣物箱裡找到一個無蓋木盒，外面的長寬高分別是 22公分、12公分和 11公分，壁厚是 1公分。這個木盒的容積是多少立方公分？可以裝多少毫升的淡水？</w:t>
+        <w:t>26. 「吉姆」在「比利·蓬斯」的水手衣物箱裡找到一個無蓋木盒，外面的長寬高分別是 22公分、12公分和 11公分，壁厚是 1公分。這個木盒的容積是多少立方公分？可以裝多少毫升的淡水？</w:t>
       </w:r>
     </w:p>
     <w:p>
@@ -2487,7 +2487,7 @@
           <w:color w:val="333333"/>
           <w:sz w:val="22"/>
         </w:rPr>
-        <w:t>27. 班·甘恩在東北方山洞裡，將黃金金條碼成了一個五角柱形狀。請問這個五角柱一共有幾個面？幾條邊？幾個頂點？</w:t>
+        <w:t>27. 「班·甘恩」在東北方山洞裡，將黃金金條碼成了一個五角柱形狀。請問這個五角柱一共有幾個面？幾條邊？幾個頂點？</w:t>
       </w:r>
     </w:p>
     <w:p>
@@ -2566,7 +2566,7 @@
           <w:color w:val="333333"/>
           <w:sz w:val="22"/>
         </w:rPr>
-        <w:t>28. 金銀島上的老海盜祭壇殘留著一個六角錐石柱。請問這個六角錐一共有幾個面？幾條邊？幾個頂點？</w:t>
+        <w:t>28. 「金銀島」上的老海盜祭壇殘留著一個六角錐石柱。請問這個六角錐一共有幾個面？幾條邊？幾個頂點？</w:t>
       </w:r>
     </w:p>
     <w:p>
@@ -2676,7 +2676,7 @@
           <w:color w:val="333333"/>
           <w:sz w:val="22"/>
         </w:rPr>
-        <w:t>29. 水手們在伊斯班紐拉號上慶祝平安抵達，切分一個圓形麵包，切出一個 120度圓心角的扇形給吉姆。這個扇形麵包是幾分之幾圓？</w:t>
+        <w:t>29. 水手們在「伊斯班紐拉號」上慶祝平安抵達，切分一個圓形麵包，切出一個 120度圓心角的扇形給「吉姆」。這個扇形麵包是幾分之幾圓？</w:t>
       </w:r>
     </w:p>
     <w:p>
@@ -2755,7 +2755,7 @@
           <w:color w:val="333333"/>
           <w:sz w:val="22"/>
         </w:rPr>
-        <w:t>30. 弗林特船長的密碼羅盤半徑是 12公分，其中一個指向寶藏入口的 1/4圓扇形區域。請問這個扇形區域的圓心角是多少度？面積是多少平方公分？（圓周率以 3.14 計算）</w:t>
+        <w:t>30. 「弗林特」船長的密碼羅盤半徑是 12公分，其中一個指向寶藏入口的 1/4圓扇形區域。請問這個扇形區域的圓心角是多少度？面積是多少平方公分？（圓周率以 3.14 計算）</w:t>
       </w:r>
     </w:p>
     <w:p>
@@ -2865,7 +2865,7 @@
           <w:color w:val="333333"/>
           <w:sz w:val="22"/>
         </w:rPr>
-        <w:t>31. 吉姆和夥伴們在金銀島上搭建了一間底 15公尺、高 8公尺的平行四邊形臨時木屋。這間木屋的佔地面積是多少平方公尺？</w:t>
+        <w:t>31. 「吉姆」和夥伴們在「金銀島」上搭建了一間底 15公尺、高 8公尺的平行四邊形臨時木屋。這間木屋的佔地面積是多少平方公尺？</w:t>
       </w:r>
     </w:p>
     <w:p>
@@ -2944,7 +2944,7 @@
           <w:color w:val="333333"/>
           <w:sz w:val="22"/>
         </w:rPr>
-        <w:t>32. 伊斯班紐拉號上掛著一面三角形的英國國旗，底是 12公寸，面積是 48平方公寸。這面旗子的高是多少公寸？</w:t>
+        <w:t>32. 「伊斯班紐拉號」上掛著一面三角形的英國國旗，底是 12公寸，面積是 48平方公寸。這面旗子的高是多少公寸？</w:t>
       </w:r>
     </w:p>
     <w:p>
@@ -3054,7 +3054,7 @@
           <w:color w:val="333333"/>
           <w:sz w:val="22"/>
         </w:rPr>
-        <w:t>33. 比利·蓬斯收藏祕密地圖的長方體鐵盒，長 10公分、寬 6公分、高 5公分。它的表面積和體積各是多少？</w:t>
+        <w:t>33. 「比利·蓬斯」收藏祕密地圖的長方體鐵盒，長 10公分、寬 6公分、高 5公分。它的表面積和體積各是多少？</w:t>
       </w:r>
     </w:p>
     <w:p>
@@ -3133,7 +3133,7 @@
           <w:color w:val="333333"/>
           <w:sz w:val="22"/>
         </w:rPr>
-        <w:t>34. 吉姆在伊斯班紐拉號的貨艙找到一個正方體彈藥箱，邊長是 8公寸。它的表面積和體積各是多少？</w:t>
+        <w:t>34. 「吉姆」在「伊斯班紐拉號」的貨艙找到一個正方體彈藥箱，邊長是 8公寸。它的表面積和體積各是多少？</w:t>
       </w:r>
     </w:p>
     <w:p>
@@ -3197,7 +3197,7 @@
           <w:color w:val="464646"/>
           <w:sz w:val="21"/>
         </w:rPr>
-        <w:t>(D) 表面積512平方公寸，體積384立方公寸</w:t>
+        <w:t>(D) 表面積512平方公寸, 體積384立方公寸</w:t>
       </w:r>
     </w:p>
     <w:p>
@@ -3243,7 +3243,7 @@
           <w:color w:val="333333"/>
           <w:sz w:val="22"/>
         </w:rPr>
-        <w:t>35. 吉姆用來繪製海島航線的三角板是一個等腰三角形。已知它的頂角是 50度，那它的兩個底角各是多少度？</w:t>
+        <w:t>35. 「吉姆」用來繪製「金銀島」航線的三角板是一個等腰三角形。已知它的頂角是 50度，那它的兩個底角各是多少度？</w:t>
       </w:r>
     </w:p>
     <w:p>
@@ -3322,7 +3322,7 @@
           <w:color w:val="333333"/>
           <w:sz w:val="22"/>
         </w:rPr>
-        <w:t>36. 伊斯班紐拉號上的四邊形船尾甲板，其內角和是多少度？我們可以用什麼簡單的方法，把四邊形切開來證明？</w:t>
+        <w:t>36. 「伊斯班紐拉號」上的四邊形船尾甲板，其內角和是多少度？我們可以用什麼簡單的方法，把四邊形切開來證明？</w:t>
       </w:r>
     </w:p>
     <w:p>
@@ -3432,7 +3432,7 @@
           <w:color w:val="333333"/>
           <w:sz w:val="22"/>
         </w:rPr>
-        <w:t>37. 西爾弗在研究海盜骷髏旗時，吉姆提到骷髏圖案是個『線對稱圖形』。請問什麼是『線對稱圖形』？請選出一個生活中的線對稱圖形例子。</w:t>
+        <w:t>37. 「西爾弗」在研究海盜骷髏旗時，「吉姆」提到骷髏圖案是個『線對稱圖形』。請問什麼是『線對稱圖形』？請選出一個生活中的線對稱圖形例子。</w:t>
       </w:r>
     </w:p>
     <w:p>
@@ -3480,7 +3480,7 @@
           <w:color w:val="464646"/>
           <w:sz w:val="21"/>
         </w:rPr>
-        <w:t>(C) 沿著一個點旋轉後能完全重合的圖形；如風車</w:t>
+        <w:t>(C) 沿著一個點逆時針旋轉後能完全重合的圖形；如風車</w:t>
       </w:r>
     </w:p>
     <w:p>
@@ -3511,7 +3511,7 @@
           <w:color w:val="333333"/>
           <w:sz w:val="22"/>
         </w:rPr>
-        <w:t>38. 吉姆拿著三張不同形狀的地圖殘片：等腰三角形、正方形與圓形。請問它們一共有幾條對稱軸？</w:t>
+        <w:t>38. 「吉姆」拿著三張不同形狀的地圖殘片：等腰三角形、正方形與圓形。請問它們一共有幾條對稱軸？</w:t>
       </w:r>
     </w:p>
     <w:p>
@@ -3621,7 +3621,7 @@
           <w:color w:val="333333"/>
           <w:sz w:val="22"/>
         </w:rPr>
-        <w:t>39. 吉姆用放大鏡觀察藏寶圖上一個三角形的『骷髏山』標記，各邊長變為原來的 3倍。這是一個什麼圖？它的每個內角度數會變為原來的幾倍？</w:t>
+        <w:t>39. 「吉姆」用放大鏡觀察藏寶圖上一個三角形的「骷髏山」標記，各邊長變為原來的 3倍。這是一個什麼圖？它的每個內角度數會變為原來的幾倍？</w:t>
       </w:r>
     </w:p>
     <w:p>
@@ -3700,7 +3700,7 @@
           <w:color w:val="333333"/>
           <w:sz w:val="22"/>
         </w:rPr>
-        <w:t>40. 船長把長 10公分、寬 6公分的長方形伊斯班紐拉號艙位圖，縮小為 1/2 倍繪製在筆記本上。這張縮小圖的長、寬和面積各是多少？</w:t>
+        <w:t>40. 船長把長 10公分、寬 6公分的長方形「伊斯班紐拉號」艙位圖，縮小為 1/2 倍繪製在筆記本上。這張縮小圖的長、寬和面積各是多少？</w:t>
       </w:r>
     </w:p>
     <w:p>
@@ -3810,7 +3810,7 @@
           <w:color w:val="333333"/>
           <w:sz w:val="22"/>
         </w:rPr>
-        <w:t>41. 弗林特船長給水手們發放獎勵，每人分得 35 枚西班牙金幣，一共有 99 人。算算看，怎麼算最快？ 99 × 35 = ( )。你運用了什麼計算規則？</w:t>
+        <w:t>41. 「弗林特」船長給水手們發放獎勵，每人分得 35 枚西班牙金幣，一共有 99 人。算算看，怎麼算最快？ 99 × 35 = ( )。你運用了什麼計算規則？</w:t>
       </w:r>
     </w:p>
     <w:p>
@@ -3999,7 +3999,7 @@
           <w:color w:val="333333"/>
           <w:sz w:val="22"/>
         </w:rPr>
-        <w:t>43. 醫生李甫西在調配藥劑時，先加入了 3/4 加侖的淨水，又加入了 1.25 × 2 加侖的藥液。算算看： 3/4 + 1.25 × 2 = ( )。分數與小數混合時怎麼計算？</w:t>
+        <w:t>43. 醫生「李甫西」在調配藥劑時，先加入了 3/4 加侖的淨水，又加入了 1.25 × 2 加侖的藥液。算算看： 3/4 + 1.25 × 2 = ( )。分數與小數混合時怎麼計算？</w:t>
       </w:r>
     </w:p>
     <w:p>
@@ -4078,7 +4078,7 @@
           <w:color w:val="333333"/>
           <w:sz w:val="22"/>
         </w:rPr>
-        <w:t>44. 吉姆試圖用公式解鎖班·甘恩在山洞中擺放的羅盤鎖： (2.4 - 1.2) ÷ 3/5 = ( )。請算算看結果是多少？</w:t>
+        <w:t>44. 「吉姆」試圖用公式解鎖「班·甘恩」在山洞中擺放的羅盤鎖： (2.4 - 1.2) ÷ 3/5 = ( )。請算算看結果是多少？</w:t>
       </w:r>
     </w:p>
     <w:p>
@@ -4188,7 +4188,7 @@
           <w:color w:val="333333"/>
           <w:sz w:val="22"/>
         </w:rPr>
-        <w:t>45. 醫生李甫西的年齡比大副比利·蓬斯大 4 歲。如果用 x 表示醫生的年齡，比利的年齡要怎麼表示？</w:t>
+        <w:t>45. 醫生「李甫西」的年齡比大副「比利·蓬斯」大 4 歲。如果用 x 表示醫生的年齡，「比利」的年齡要怎麼表示？</w:t>
       </w:r>
     </w:p>
     <w:p>
@@ -4267,7 +4267,7 @@
           <w:color w:val="333333"/>
           <w:sz w:val="22"/>
         </w:rPr>
-        <w:t>46. 港口的一把佩劍賣 x 枚銀幣，吉姆買了 3 把，付了 500 枚銀幣。商家要找回他多少枚銀幣？用含有 x 的算式表述。</w:t>
+        <w:t>46. 港口的一把佩劍賣 x 枚銀幣，「吉姆」買了 3 把，付了 500 枚銀幣。商家要找回他多少枚銀幣？用含有 x 的算式表述。</w:t>
       </w:r>
     </w:p>
     <w:p>
@@ -4377,7 +4377,7 @@
           <w:color w:val="333333"/>
           <w:sz w:val="22"/>
         </w:rPr>
-        <w:t>47. 伊斯班紐拉號上的圖書櫃有各種航海書籍，圓形百分圖中顯示：航海誌佔 40%、天文與氣象書佔 30%、地理圖冊佔 20%、其他佔 10%。如果一共有 200本書，航海誌有幾本？</w:t>
+        <w:t>47. 「伊斯班紐拉號」上的圖書櫃有各種航海書籍，圓形百分圖中顯示：航海誌佔 40%、天文與氣象書佔 30%、地理圖冊佔 20%、其他佔 10%。如果一共有 200本書，航海誌有幾本？</w:t>
       </w:r>
     </w:p>
     <w:p>
@@ -4456,7 +4456,7 @@
           <w:color w:val="333333"/>
           <w:sz w:val="22"/>
         </w:rPr>
-        <w:t>48. 吉姆想在伊斯班紐拉號的圓形舵盤上畫出一個代表 25% 的『安全轉向舵角區』。在圓形圖上，這個區域的圓心角應該是多少度？</w:t>
+        <w:t>48. 「吉姆」想在「伊斯班紐拉號」的圓形舵盤上畫出一個代表 25% 的『安全轉向舵角區』。在圓形圖上，這個區域的圓心角應該是多少度？</w:t>
       </w:r>
     </w:p>
     <w:p>
@@ -4566,7 +4566,7 @@
           <w:color w:val="333333"/>
           <w:sz w:val="22"/>
         </w:rPr>
-        <w:t>49. 班·甘恩把 8 顆黑石子和 2 顆白石子放進袋子裡。吉姆不看袋子摸出一顆石子，摸到黑石子的可能性大還是白石子大？為什麼？</w:t>
+        <w:t>49. 「班·甘恩」把 8 顆黑石子和 2 顆白石子放進袋子裡。「吉姆」不看袋子摸出一顆石子，摸到黑石子的可能性大還是白石子大？為什麼？</w:t>
       </w:r>
     </w:p>
     <w:p>
@@ -4645,7 +4645,7 @@
           <w:color w:val="333333"/>
           <w:sz w:val="22"/>
         </w:rPr>
-        <w:t>50. 西爾弗和船員們在甲板上玩擲骰子遊戲，丟一個公正的骰子（點數1~6），丟出奇數點和偶數點的可能性一樣大嗎？為什麼？</w:t>
+        <w:t>50. 「西爾弗」和船員們在甲板上玩擲骰子遊戲，丟一個公正的骰子（點數1~6），丟出奇數點和偶數點的可能性一樣大嗎？為什麼？</w:t>
       </w:r>
     </w:p>
     <w:p>

</xml_diff>